<commit_message>
Actualiza resumen ejecutivo y cifras del modelo con Navarra ya incorporada
</commit_message>
<xml_diff>
--- a/resumen_ejecutivo_debate_lenguas.docx
+++ b/resumen_ejecutivo_debate_lenguas.docx
@@ -132,7 +132,7 @@
           <w:sz w:val="22"/>
           <w:szCs w:val="22"/>
         </w:rPr>
-        <w:t xml:space="preserve">El modelo estadístico ajustado (que combina nivel de estudiante, colegio y comunidad autónoma, y controla por origen migrante, nivel socioeconómico, educación de los padres y género) estima que, en 2025, la incongruencia lingüística — hacer el examen en un idioma distinto al de casa — penaliza de forma similar en los centros monolingües castellano (−13,4 puntos PISA; intervalo de confianza del 95%: −21,8 a −5,0) y en los centros monolingües en lengua cooficial (−11,8 puntos; intervalo: −20,1 a −3,4). Las dos estimaciones son estadísticamente indistinguibles entre sí, y las dos son negativas y significativas; el único tipo de centro sin penalización detectable es el mixto. Si el problema fuera específicamente el empleo forzado de la lengua cooficial frente al castellano, cabría esperar una penalización marcadamente mayor — o exclusiva — en los centros cooficiales, y eso no es lo que el modelo encuentra.</w:t>
+        <w:t xml:space="preserve">El modelo estadístico ajustado (que combina nivel de estudiante, colegio y comunidad autónoma, y controla por origen migrante, nivel socioeconómico, educación de los padres y género) estima que, en 2025, la incongruencia lingüística — hacer el examen en un idioma distinto al de casa — penaliza de forma similar en los centros monolingües castellano (−13,4 puntos PISA; intervalo de confianza del 95%: −20,8 a −6,0) y en los centros monolingües en lengua cooficial (−11,8 puntos; intervalo: −19,2 a −4,4). Las dos estimaciones son estadísticamente indistinguibles entre sí, y las dos son negativas y significativas; el único tipo de centro sin penalización detectable es el mixto. Si el problema fuera específicamente el empleo forzado de la lengua cooficial frente al castellano, cabría esperar una penalización marcadamente mayor — o exclusiva — en los centros cooficiales, y eso no es lo que el modelo encuentra.</w:t>
       </w:r>
     </w:p>
     <w:p>
@@ -473,7 +473,7 @@
                 <w:sz w:val="20"/>
                 <w:szCs w:val="20"/>
               </w:rPr>
-              <w:t xml:space="preserve">−13,4 pts (IC95%: −21,8 a −5,0)</w:t>
+              <w:t xml:space="preserve">−13,4 pts (IC95%: −20,8 a −6,0)</w:t>
             </w:r>
           </w:p>
         </w:tc>
@@ -495,7 +495,7 @@
                 <w:sz w:val="20"/>
                 <w:szCs w:val="20"/>
               </w:rPr>
-              <w:t xml:space="preserve">−11,8 pts (IC95%: −20,1 a −3,4)</w:t>
+              <w:t xml:space="preserve">−11,8 pts (IC95%: −19,2 a −4,4)</w:t>
             </w:r>
           </w:p>
         </w:tc>
@@ -980,7 +980,7 @@
           <w:sz w:val="22"/>
           <w:szCs w:val="22"/>
         </w:rPr>
-        <w:t xml:space="preserve">La incorporación de Navarra al modelo estadístico ajustado (el modelo multinivel bayesiano que produce las cifras de la primera sección) está pendiente en el momento de escribir este resumen: esas cifras corresponden todavía a la muestra de cinco comunidades autónomas, sin Navarra. Los datos descriptivos de Navarra, en cambio, ya están incorporados y se citan donde corresponde. El peso de Navarra en la muestra conjunta es moderado (en torno al 15% del alumnado analizado), por lo que no se espera que su incorporación cambie la imagen general aquí descrita, pero las cifras exactas del modelo se actualizarán cuando se reajuste.</w:t>
+        <w:t xml:space="preserve">El modelo estadístico ajustado ya incorpora Navarra (las cifras de la primera sección corresponden a las seis comunidades autónomas conjuntas). Su inclusión apenas modifica las estimaciones respecto a la muestra previa de cinco comunidades: el efecto total de la incongruencia en 2025 se mantiene en −13,4 puntos en centros monolingües castellano y −11,8 puntos en monolingües cooficiales, con intervalos de confianza ligeramente más estrechos al aumentar el tamaño muestral.</w:t>
       </w:r>
     </w:p>
     <w:p>

</xml_diff>